<commit_message>
docs(report): add GitHub branch link to Lab 03 report
</commit_message>
<xml_diff>
--- a/SPEC/BAO_CAO_LAB_03_2312758_NguyenHongPhucTho.docx
+++ b/SPEC/BAO_CAO_LAB_03_2312758_NguyenHongPhucTho.docx
@@ -184,6 +184,10 @@
             <w:insideH w:val="single" w:color="auto" w:sz="4" w:space="0"/>
             <w:insideV w:val="single" w:color="auto" w:sz="4" w:space="0"/>
           </w:tblBorders>
+          <w:tblCellMar>
+            <w:left w:w="108" w:type="dxa"/>
+            <w:right w:w="108" w:type="dxa"/>
+          </w:tblCellMar>
         </w:tblPrEx>
         <w:tc>
           <w:tcPr>
@@ -839,7 +843,7 @@
           <w:sz w:val="20"/>
           <w:lang w:val="en-US"/>
         </w:rPr>
-        <w:t>Link: https://github.com/ThangThieng/Phat_trien_ung_dung_web_nang_cao/commits/2312758_NguyenHongPhucTho_buoiso3</w:t>
+        <w:t>GitHub branch: 2312758_NguyenHongPhucTho_buoiso3</w:t>
       </w:r>
     </w:p>
     <w:p>

</xml_diff>

<commit_message>
feat(b4): integrate supplied Buoi 4 implementation
</commit_message>
<xml_diff>
--- a/SPEC/BAO_CAO_LAB_03_2312758_NguyenHongPhucTho.docx
+++ b/SPEC/BAO_CAO_LAB_03_2312758_NguyenHongPhucTho.docx
@@ -184,6 +184,10 @@
             <w:insideH w:val="single" w:color="auto" w:sz="4" w:space="0"/>
             <w:insideV w:val="single" w:color="auto" w:sz="4" w:space="0"/>
           </w:tblBorders>
+          <w:tblCellMar>
+            <w:left w:w="108" w:type="dxa"/>
+            <w:right w:w="108" w:type="dxa"/>
+          </w:tblCellMar>
         </w:tblPrEx>
         <w:tc>
           <w:tcPr>
@@ -839,7 +843,7 @@
           <w:sz w:val="20"/>
           <w:lang w:val="en-US"/>
         </w:rPr>
-        <w:t>Link: https://github.com/ThangThieng/Phat_trien_ung_dung_web_nang_cao/commits/2312758_NguyenHongPhucTho_buoiso3</w:t>
+        <w:t>GitHub branch: 2312758_NguyenHongPhucTho_buoiso3</w:t>
       </w:r>
     </w:p>
     <w:p>

</xml_diff>